<commit_message>
Adiciona diagramas visuais faltantes nas aulas de UML, UX e Canvas
As Aulas 4-11 e 14 pediam para reproduzir/comparar diagramas (casos de
uso, classes, atividades, sequencia, wireframe, canvas de modelo de
negocio) que nunca apareciam de fato nos slides ou na apostila - so
existiam como instrucao em texto. Esta atualizacao adiciona as imagens
correspondentes nos slides e nas apostilas dessas aulas.
</commit_message>
<xml_diff>
--- a/Aula 08 - 09-10-2026/Aula 8 - Apostila do Aluno.docx
+++ b/Aula 08 - 09-10-2026/Aula 8 - Apostila do Aluno.docx
@@ -364,6 +364,46 @@
     </w:p>
     <w:p>
       <w:pPr>
+        <w:jc w:val="center"/>
+      </w:pPr>
+      <w:r>
+        <w:drawing>
+          <wp:inline xmlns:a="http://schemas.openxmlformats.org/drawingml/2006/main" xmlns:pic="http://schemas.openxmlformats.org/drawingml/2006/picture">
+            <wp:extent cx="5040000" cy="2382545"/>
+            <wp:docPr id="1" name="Picture 1"/>
+            <wp:cNvGraphicFramePr>
+              <a:graphicFrameLocks noChangeAspect="1"/>
+            </wp:cNvGraphicFramePr>
+            <a:graphic>
+              <a:graphicData uri="http://schemas.openxmlformats.org/drawingml/2006/picture">
+                <pic:pic>
+                  <pic:nvPicPr>
+                    <pic:cNvPr id="0" name="exemplo_sequencia_elementos.png"/>
+                    <pic:cNvPicPr/>
+                  </pic:nvPicPr>
+                  <pic:blipFill>
+                    <a:blip r:embed="rId9"/>
+                    <a:stretch>
+                      <a:fillRect/>
+                    </a:stretch>
+                  </pic:blipFill>
+                  <pic:spPr>
+                    <a:xfrm>
+                      <a:off x="0" y="0"/>
+                      <a:ext cx="5040000" cy="2382545"/>
+                    </a:xfrm>
+                    <a:prstGeom prst="rect"/>
+                  </pic:spPr>
+                </pic:pic>
+              </a:graphicData>
+            </a:graphic>
+          </wp:inline>
+        </w:drawing>
+      </w:r>
+    </w:p>
+    <w:p/>
+    <w:p>
+      <w:pPr>
         <w:pStyle w:val="Heading1"/>
       </w:pPr>
       <w:r>

</xml_diff>

<commit_message>
Aula 8: atividade guiada direto nos passos, sem slides de história
Remove os slides da história, 'quem é quem', 'primeiro no quadro',
'lendo o mapa da tela' e 'conferindo com dois clientes' (122 -> 117 slides);
troca 'Maria' por 'o cliente'. Apostila (docx/pdf) acompanha.
</commit_message>
<xml_diff>
--- a/Aula 08 - 09-10-2026/Aula 8 - Apostila do Aluno.docx
+++ b/Aula 08 - 09-10-2026/Aula 8 - Apostila do Aluno.docx
@@ -3573,479 +3573,11 @@
       </w:r>
     </w:p>
     <w:p>
-      <w:pPr/>
-      <w:r>
-        <w:rPr>
-          <w:b/>
-        </w:rPr>
-        <w:t xml:space="preserve">A história. </w:t>
-      </w:r>
-      <w:r>
-        <w:t>Na Aula 7, o diagrama do pedido pelo app tinha a ação “Credita os pontos de fidelidade”. Agora vamos abrir essa ação e mostrar QUEM faz O QUÊ, e em que ordem. Usaremos um caso concreto: a Maria tem 95 pontos e acabou de pagar uma compra de R$ 62,00. O pagamento já foi aprovado e fica de fora deste diagrama (ele é assunto da Atividade 1).</w:t>
-      </w:r>
-    </w:p>
-    <w:p>
-      <w:pPr/>
-      <w:r>
-        <w:rPr>
-          <w:b/>
-        </w:rPr>
-        <w:t xml:space="preserve">Quem é quem: </w:t>
-      </w:r>
-      <w:r>
-        <w:t>o ator Cliente (o boneco, à esquerda) é a PESSOA Maria, com o celular na mão; :App é o aplicativo do TechBurger, que recebe o toque e repassa o trabalho; :Cliente é o objeto com os DADOS da Maria dentro do sistema (pontosFidelidade = 95). Da Aula 5, a classe Cliente tem - pontosFidelidade: Inteiro, + acumularPontos(valor: Real) e + resgatarCombo(): Booleano. Quem calcula os pontos é o próprio :Cliente, porque o atributo é privado (-): só ele pode mexer nos pontos (encapsulamento).</w:t>
-      </w:r>
-    </w:p>
-    <w:p>
-      <w:pPr/>
-      <w:r>
-        <w:rPr>
-          <w:b/>
-        </w:rPr>
-        <w:t xml:space="preserve">Primeiro no papel: </w:t>
-      </w:r>
-      <w:r>
-        <w:t>antes de abrir o draw.io, escreva a lista de mensagens na ordem em que acontecem:</w:t>
-      </w:r>
-    </w:p>
-    <w:tbl>
-      <w:tblPr>
-        <w:tblStyle w:val="TableGrid"/>
-        <w:tblW w:type="auto" w:w="0"/>
-        <w:tblLayout w:type="fixed"/>
-        <w:tblLook w:firstColumn="1" w:firstRow="1" w:lastColumn="0" w:lastRow="0" w:noHBand="0" w:noVBand="1" w:val="04A0"/>
-      </w:tblPr>
-      <w:tblGrid>
-        <w:gridCol w:w="2493"/>
-        <w:gridCol w:w="2493"/>
-        <w:gridCol w:w="2493"/>
-        <w:gridCol w:w="2493"/>
-      </w:tblGrid>
-      <w:tr>
-        <w:tc>
-          <w:tcPr>
-            <w:tcW w:type="dxa" w:w="648"/>
-            <w:shd w:val="clear" w:color="auto" w:fill="1F497D"/>
-          </w:tcPr>
-          <w:p>
-            <w:r/>
-            <w:r>
-              <w:rPr>
-                <w:b/>
-                <w:color w:val="FFFFFF"/>
-                <w:sz w:val="20"/>
-              </w:rPr>
-              <w:t>Nº</w:t>
-            </w:r>
-          </w:p>
-        </w:tc>
-        <w:tc>
-          <w:tcPr>
-            <w:tcW w:type="dxa" w:w="2088"/>
-            <w:shd w:val="clear" w:color="auto" w:fill="1F497D"/>
-          </w:tcPr>
-          <w:p>
-            <w:r/>
-            <w:r>
-              <w:rPr>
-                <w:b/>
-                <w:color w:val="FFFFFF"/>
-                <w:sz w:val="20"/>
-              </w:rPr>
-              <w:t>De → Para</w:t>
-            </w:r>
-          </w:p>
-        </w:tc>
-        <w:tc>
-          <w:tcPr>
-            <w:tcW w:type="dxa" w:w="2736"/>
-            <w:shd w:val="clear" w:color="auto" w:fill="1F497D"/>
-          </w:tcPr>
-          <w:p>
-            <w:r/>
-            <w:r>
-              <w:rPr>
-                <w:b/>
-                <w:color w:val="FFFFFF"/>
-                <w:sz w:val="20"/>
-              </w:rPr>
-              <w:t>Mensagem</w:t>
-            </w:r>
-          </w:p>
-        </w:tc>
-        <w:tc>
-          <w:tcPr>
-            <w:tcW w:type="dxa" w:w="3888"/>
-            <w:shd w:val="clear" w:color="auto" w:fill="1F497D"/>
-          </w:tcPr>
-          <w:p>
-            <w:r/>
-            <w:r>
-              <w:rPr>
-                <w:b/>
-                <w:color w:val="FFFFFF"/>
-                <w:sz w:val="20"/>
-              </w:rPr>
-              <w:t>Por quê</w:t>
-            </w:r>
-          </w:p>
-        </w:tc>
-      </w:tr>
-      <w:tr>
-        <w:tc>
-          <w:tcPr>
-            <w:tcW w:type="dxa" w:w="648"/>
-          </w:tcPr>
-          <w:p>
-            <w:r/>
-            <w:r>
-              <w:rPr>
-                <w:sz w:val="20"/>
-              </w:rPr>
-              <w:t>1</w:t>
-            </w:r>
-          </w:p>
-        </w:tc>
-        <w:tc>
-          <w:tcPr>
-            <w:tcW w:type="dxa" w:w="2088"/>
-          </w:tcPr>
-          <w:p>
-            <w:r/>
-            <w:r>
-              <w:rPr>
-                <w:sz w:val="20"/>
-              </w:rPr>
-              <w:t>Cliente → :App</w:t>
-            </w:r>
-          </w:p>
-        </w:tc>
-        <w:tc>
-          <w:tcPr>
-            <w:tcW w:type="dxa" w:w="2736"/>
-          </w:tcPr>
-          <w:p>
-            <w:r/>
-            <w:r>
-              <w:rPr>
-                <w:sz w:val="20"/>
-              </w:rPr>
-              <w:t>finalizarCompra()</w:t>
-            </w:r>
-          </w:p>
-        </w:tc>
-        <w:tc>
-          <w:tcPr>
-            <w:tcW w:type="dxa" w:w="3888"/>
-          </w:tcPr>
-          <w:p>
-            <w:r/>
-            <w:r>
-              <w:rPr>
-                <w:sz w:val="20"/>
-              </w:rPr>
-              <w:t>A Maria toca no botão e espera a resposta (síncrona).</w:t>
-            </w:r>
-          </w:p>
-        </w:tc>
-      </w:tr>
-      <w:tr>
-        <w:tc>
-          <w:tcPr>
-            <w:tcW w:type="dxa" w:w="648"/>
-          </w:tcPr>
-          <w:p>
-            <w:r/>
-            <w:r>
-              <w:rPr>
-                <w:sz w:val="20"/>
-              </w:rPr>
-              <w:t>2</w:t>
-            </w:r>
-          </w:p>
-        </w:tc>
-        <w:tc>
-          <w:tcPr>
-            <w:tcW w:type="dxa" w:w="2088"/>
-          </w:tcPr>
-          <w:p>
-            <w:r/>
-            <w:r>
-              <w:rPr>
-                <w:sz w:val="20"/>
-              </w:rPr>
-              <w:t>:App → :Cliente</w:t>
-            </w:r>
-          </w:p>
-        </w:tc>
-        <w:tc>
-          <w:tcPr>
-            <w:tcW w:type="dxa" w:w="2736"/>
-          </w:tcPr>
-          <w:p>
-            <w:r/>
-            <w:r>
-              <w:rPr>
-                <w:sz w:val="20"/>
-              </w:rPr>
-              <w:t>acumularPontos(valorPago)</w:t>
-            </w:r>
-          </w:p>
-        </w:tc>
-        <w:tc>
-          <w:tcPr>
-            <w:tcW w:type="dxa" w:w="3888"/>
-          </w:tcPr>
-          <w:p>
-            <w:r/>
-            <w:r>
-              <w:rPr>
-                <w:sz w:val="20"/>
-              </w:rPr>
-              <w:t>O app pede aos dados da Maria para somar os pontos (valorPago = R$ 62,00).</w:t>
-            </w:r>
-          </w:p>
-        </w:tc>
-      </w:tr>
-      <w:tr>
-        <w:tc>
-          <w:tcPr>
-            <w:tcW w:type="dxa" w:w="648"/>
-          </w:tcPr>
-          <w:p>
-            <w:r/>
-            <w:r>
-              <w:rPr>
-                <w:sz w:val="20"/>
-              </w:rPr>
-              <w:t>3</w:t>
-            </w:r>
-          </w:p>
-        </w:tc>
-        <w:tc>
-          <w:tcPr>
-            <w:tcW w:type="dxa" w:w="2088"/>
-          </w:tcPr>
-          <w:p>
-            <w:r/>
-            <w:r>
-              <w:rPr>
-                <w:sz w:val="20"/>
-              </w:rPr>
-              <w:t>:Cliente → :Cliente</w:t>
-            </w:r>
-          </w:p>
-        </w:tc>
-        <w:tc>
-          <w:tcPr>
-            <w:tcW w:type="dxa" w:w="2736"/>
-          </w:tcPr>
-          <w:p>
-            <w:r/>
-            <w:r>
-              <w:rPr>
-                <w:sz w:val="20"/>
-              </w:rPr>
-              <w:t>calcularPontos(valorPago)</w:t>
-            </w:r>
-          </w:p>
-        </w:tc>
-        <w:tc>
-          <w:tcPr>
-            <w:tcW w:type="dxa" w:w="3888"/>
-          </w:tcPr>
-          <w:p>
-            <w:r/>
-            <w:r>
-              <w:rPr>
-                <w:sz w:val="20"/>
-              </w:rPr>
-              <w:t>Auto-mensagem: 62 ÷ 10 = 6 pontos → 95 + 6 = 101.</w:t>
-            </w:r>
-          </w:p>
-        </w:tc>
-      </w:tr>
-      <w:tr>
-        <w:tc>
-          <w:tcPr>
-            <w:tcW w:type="dxa" w:w="648"/>
-          </w:tcPr>
-          <w:p>
-            <w:r/>
-            <w:r>
-              <w:rPr>
-                <w:sz w:val="20"/>
-              </w:rPr>
-              <w:t>4</w:t>
-            </w:r>
-          </w:p>
-        </w:tc>
-        <w:tc>
-          <w:tcPr>
-            <w:tcW w:type="dxa" w:w="2088"/>
-          </w:tcPr>
-          <w:p>
-            <w:r/>
-            <w:r>
-              <w:rPr>
-                <w:sz w:val="20"/>
-              </w:rPr>
-              <w:t>:Cliente → :Cliente</w:t>
-            </w:r>
-          </w:p>
-        </w:tc>
-        <w:tc>
-          <w:tcPr>
-            <w:tcW w:type="dxa" w:w="2736"/>
-          </w:tcPr>
-          <w:p>
-            <w:r/>
-            <w:r>
-              <w:rPr>
-                <w:sz w:val="20"/>
-              </w:rPr>
-              <w:t>resgatarCombo()</w:t>
-            </w:r>
-          </w:p>
-        </w:tc>
-        <w:tc>
-          <w:tcPr>
-            <w:tcW w:type="dxa" w:w="3888"/>
-          </w:tcPr>
-          <w:p>
-            <w:r/>
-            <w:r>
-              <w:rPr>
-                <w:sz w:val="20"/>
-              </w:rPr>
-              <w:t>Só se [saldo ≥ 100 pontos] → fica dentro de um opt.</w:t>
-            </w:r>
-          </w:p>
-        </w:tc>
-      </w:tr>
-      <w:tr>
-        <w:tc>
-          <w:tcPr>
-            <w:tcW w:type="dxa" w:w="648"/>
-          </w:tcPr>
-          <w:p>
-            <w:r/>
-            <w:r>
-              <w:rPr>
-                <w:sz w:val="20"/>
-              </w:rPr>
-              <w:t>—</w:t>
-            </w:r>
-          </w:p>
-        </w:tc>
-        <w:tc>
-          <w:tcPr>
-            <w:tcW w:type="dxa" w:w="2088"/>
-          </w:tcPr>
-          <w:p>
-            <w:r/>
-            <w:r>
-              <w:rPr>
-                <w:sz w:val="20"/>
-              </w:rPr>
-              <w:t>:Cliente ⇢ :App</w:t>
-            </w:r>
-          </w:p>
-        </w:tc>
-        <w:tc>
-          <w:tcPr>
-            <w:tcW w:type="dxa" w:w="2736"/>
-          </w:tcPr>
-          <w:p>
-            <w:r/>
-            <w:r>
-              <w:rPr>
-                <w:sz w:val="20"/>
-              </w:rPr>
-              <w:t>saldoAtualizado</w:t>
-            </w:r>
-          </w:p>
-        </w:tc>
-        <w:tc>
-          <w:tcPr>
-            <w:tcW w:type="dxa" w:w="3888"/>
-          </w:tcPr>
-          <w:p>
-            <w:r/>
-            <w:r>
-              <w:rPr>
-                <w:sz w:val="20"/>
-              </w:rPr>
-              <w:t>Retorno (tracejado) da mensagem 2.</w:t>
-            </w:r>
-          </w:p>
-        </w:tc>
-      </w:tr>
-      <w:tr>
-        <w:tc>
-          <w:tcPr>
-            <w:tcW w:type="dxa" w:w="648"/>
-          </w:tcPr>
-          <w:p>
-            <w:r/>
-            <w:r>
-              <w:rPr>
-                <w:sz w:val="20"/>
-              </w:rPr>
-              <w:t>—</w:t>
-            </w:r>
-          </w:p>
-        </w:tc>
-        <w:tc>
-          <w:tcPr>
-            <w:tcW w:type="dxa" w:w="2088"/>
-          </w:tcPr>
-          <w:p>
-            <w:r/>
-            <w:r>
-              <w:rPr>
-                <w:sz w:val="20"/>
-              </w:rPr>
-              <w:t>:App ⇢ Cliente</w:t>
-            </w:r>
-          </w:p>
-        </w:tc>
-        <w:tc>
-          <w:tcPr>
-            <w:tcW w:type="dxa" w:w="2736"/>
-          </w:tcPr>
-          <w:p>
-            <w:r/>
-            <w:r>
-              <w:rPr>
-                <w:sz w:val="20"/>
-              </w:rPr>
-              <w:t>saldo</w:t>
-            </w:r>
-          </w:p>
-        </w:tc>
-        <w:tc>
-          <w:tcPr>
-            <w:tcW w:type="dxa" w:w="3888"/>
-          </w:tcPr>
-          <w:p>
-            <w:r/>
-            <w:r>
-              <w:rPr>
-                <w:sz w:val="20"/>
-              </w:rPr>
-              <w:t>Retorno (tracejado) da mensagem 1: a Maria vê o saldo na tela.</w:t>
-            </w:r>
-          </w:p>
-        </w:tc>
-      </w:tr>
-    </w:tbl>
-    <w:p>
       <w:pPr>
         <w:spacing w:before="200"/>
       </w:pPr>
       <w:r>
-        <w:t>Agora no draw.io. Cada passo abaixo corresponde a um slide da aula, em que o que entra naquele passo aparece em laranja.</w:t>
+        <w:t>Cada passo abaixo corresponde a um slide da aula, em que o que entra naquele passo aparece em laranja.</w:t>
       </w:r>
     </w:p>
     <w:p>
@@ -4066,7 +3598,7 @@
         <w:rPr>
           <w:b/>
         </w:rPr>
-        <w:t xml:space="preserve">Passo 1 — A Maria toca em “Finalizar compra”. </w:t>
+        <w:t xml:space="preserve">Passo 1 — O cliente toca em “Finalizar compra”. </w:t>
       </w:r>
       <w:r>
         <w:t>Arraste da paleta UML o ícone “Message”; prenda uma ponta no tracejado do boneco e a outra no tracejado do :App (a linha de vida fica destacada quando a ponta está presa). Dê duplo clique na seta e escreva “1: finalizarCompra()”. Depois solte um “Activation Bar” sobre o :App, começando na ponta da seta, e estique bem para baixo: o :App trabalha até devolver o saldo.</w:t>
@@ -4093,7 +3625,7 @@
         <w:t xml:space="preserve">Passo 3 — O :Cliente calcula os próprios pontos. </w:t>
       </w:r>
       <w:r>
-        <w:t>Use o ícone “Self Call” sobre a ativação do :Cliente: a seta sai e volta para ele mesmo. Rótulo: “3: calcularPontos(valorPago)”. Ao lado, uma nota amarela (Geral › Note) com a regra “1 ponto a cada R$ 10,00”. No caso da Maria: 6 pontos, saldo 101. Atenção: calcularPontos NÃO estava na classe Cliente da Aula 5 — o diagrama de sequência revelou um método que faltava. Anote na classe: - calcularPontos(valor: Real): Inteiro (privado, porque só o próprio Cliente o usa).</w:t>
+        <w:t>Use o ícone “Self Call” sobre a ativação do :Cliente: a seta sai e volta para ele mesmo. Rótulo: “3: calcularPontos(valorPago)”. Ao lado, uma nota amarela (Geral › Note) com a regra “1 ponto a cada R$ 10,00”. Atenção: calcularPontos NÃO estava na classe Cliente da Aula 5 — o diagrama de sequência revelou um método que faltava. Anote na classe: - calcularPontos(valor: Real): Inteiro (privado, porque só o próprio Cliente o usa).</w:t>
       </w:r>
     </w:p>
     <w:p>
@@ -4117,7 +3649,7 @@
         <w:t xml:space="preserve">Passo 5 — As respostas voltam. </w:t>
       </w:r>
       <w:r>
-        <w:t>Um “Return” do :Cliente para o :App, abaixo da moldura, com “saldoAtualizado”; outro “Return” do :App para o boneco, com “saldo”. Retornos são tracejados e voltam para quem chamou. Ajuste as ativações para terminarem onde sai o retorno. A Maria vê saldo 0: os pontos zeraram quando ela ganhou o combo.</w:t>
+        <w:t>Um “Return” do :Cliente para o :App, abaixo da moldura, com “saldoAtualizado”; outro “Return” do :App para o boneco, com “saldo”. Retornos são tracejados e voltam para quem chamou. Ajuste as ativações para terminarem onde sai o retorno.</w:t>
       </w:r>
     </w:p>
     <w:p>
@@ -4171,18 +3703,6 @@
       </w:pPr>
       <w:r>
         <w:t>Figura 11 — Resultado da atividade guiada: acumular pontos de fidelidade.</w:t>
-      </w:r>
-    </w:p>
-    <w:p>
-      <w:pPr/>
-      <w:r>
-        <w:rPr>
-          <w:b/>
-        </w:rPr>
-        <w:t xml:space="preserve">Conferindo com dois clientes: </w:t>
-      </w:r>
-      <w:r>
-        <w:t>o mesmo diagrama serve para clientes diferentes. Maria: 95 pontos + R$ 62,00 → 6 pontos → 101; a guarda é verdadeira, o opt acontece, ela ganha o combo e o saldo vai a 0. João: 40 pontos + R$ 35,00 → 3 pontos → 43; a guarda é falsa, o opt é pulado: acontecem as mensagens 1, 2, 3 e os retornos (saldo 43), mas não a 4.</w:t>
       </w:r>
     </w:p>
     <w:p>

</xml_diff>